<commit_message>
docs(progress): add GitHub links to every figure in the MSA1 narrative
Each figure now carries a clickable GitHub link (branch dataset/texas-capmetro-801),
plus an appendix with folder links and a per-figure index, so the team can open
any figure directly from the doc.

Co-Authored-By: Claude Opus 4.8 <noreply@anthropic.com>
</commit_message>
<xml_diff>
--- a/docs/progress/B3_MSA1_Presentation_Narrative.docx
+++ b/docs/progress/B3_MSA1_Presentation_Narrative.docx
@@ -656,7 +656,7 @@
     </w:p>
     <w:p>
       <w:pPr>
-        <w:spacing w:after="120"/>
+        <w:spacing w:after="20"/>
         <w:jc w:val="center"/>
       </w:pPr>
       <w:r>
@@ -670,6 +670,34 @@
         </w:rPr>
         <w:t xml:space="preserve">The 26-stop direction-6 corridor (marker size = demand).</w:t>
       </w:r>
+    </w:p>
+    <w:p>
+      <w:pPr>
+        <w:spacing w:after="120"/>
+        <w:jc w:val="center"/>
+      </w:pPr>
+      <w:r>
+        <w:rPr>
+          <w:rFonts w:ascii="Calibri" w:cs="Calibri" w:eastAsia="Calibri" w:hAnsi="Calibri"/>
+          <w:color w:val="5B6B79"/>
+          <w:sz w:val="16"/>
+          <w:szCs w:val="16"/>
+        </w:rPr>
+        <w:t xml:space="preserve">⬇ on GitHub: </w:t>
+      </w:r>
+      <w:hyperlink w:history="1" r:id="rIdtdq8togn4hi8yqecwjlcs">
+        <w:r>
+          <w:rPr>
+            <w:rStyle w:val="Hyperlink"/>
+            <w:rFonts w:ascii="Calibri" w:cs="Calibri" w:eastAsia="Calibri" w:hAnsi="Calibri"/>
+            <w:color w:val="0563C1"/>
+            <w:sz w:val="16"/>
+            <w:szCs w:val="16"/>
+            <w:u w:val="single"/>
+          </w:rPr>
+          <w:t xml:space="preserve">github.com/…/fig_corridor_map.png</w:t>
+        </w:r>
+      </w:hyperlink>
     </w:p>
     <w:p>
       <w:pPr>
@@ -816,7 +844,7 @@
     </w:p>
     <w:p>
       <w:pPr>
-        <w:spacing w:after="120"/>
+        <w:spacing w:after="20"/>
         <w:jc w:val="center"/>
       </w:pPr>
       <w:r>
@@ -830,6 +858,34 @@
         </w:rPr>
         <w:t xml:space="preserve">Route 801 is the highest-boarding route; direction 6 is the study direction.</w:t>
       </w:r>
+    </w:p>
+    <w:p>
+      <w:pPr>
+        <w:spacing w:after="120"/>
+        <w:jc w:val="center"/>
+      </w:pPr>
+      <w:r>
+        <w:rPr>
+          <w:rFonts w:ascii="Calibri" w:cs="Calibri" w:eastAsia="Calibri" w:hAnsi="Calibri"/>
+          <w:color w:val="5B6B79"/>
+          <w:sz w:val="16"/>
+          <w:szCs w:val="16"/>
+        </w:rPr>
+        <w:t xml:space="preserve">⬇ on GitHub: </w:t>
+      </w:r>
+      <w:hyperlink w:history="1" r:id="rId76xbdhevyff0kohalgpws">
+        <w:r>
+          <w:rPr>
+            <w:rStyle w:val="Hyperlink"/>
+            <w:rFonts w:ascii="Calibri" w:cs="Calibri" w:eastAsia="Calibri" w:hAnsi="Calibri"/>
+            <w:color w:val="0563C1"/>
+            <w:sz w:val="16"/>
+            <w:szCs w:val="16"/>
+            <w:u w:val="single"/>
+          </w:rPr>
+          <w:t xml:space="preserve">github.com/…/fig_route_selection.png</w:t>
+        </w:r>
+      </w:hyperlink>
     </w:p>
     <w:p>
       <w:pPr>
@@ -1938,7 +1994,7 @@
     </w:p>
     <w:p>
       <w:pPr>
-        <w:spacing w:after="120"/>
+        <w:spacing w:after="20"/>
         <w:jc w:val="center"/>
       </w:pPr>
       <w:r>
@@ -1952,6 +2008,34 @@
         </w:rPr>
         <w:t xml:space="preserve">Daily precipitation, NOAA LCDv2 (Camp Mabry), Jul–Dec 2021 — rain is episodic.</w:t>
       </w:r>
+    </w:p>
+    <w:p>
+      <w:pPr>
+        <w:spacing w:after="120"/>
+        <w:jc w:val="center"/>
+      </w:pPr>
+      <w:r>
+        <w:rPr>
+          <w:rFonts w:ascii="Calibri" w:cs="Calibri" w:eastAsia="Calibri" w:hAnsi="Calibri"/>
+          <w:color w:val="5B6B79"/>
+          <w:sz w:val="16"/>
+          <w:szCs w:val="16"/>
+        </w:rPr>
+        <w:t xml:space="preserve">⬇ on GitHub: </w:t>
+      </w:r>
+      <w:hyperlink w:history="1" r:id="rIdxdzdkghrbsydv4mdxe3zo">
+        <w:r>
+          <w:rPr>
+            <w:rStyle w:val="Hyperlink"/>
+            <w:rFonts w:ascii="Calibri" w:cs="Calibri" w:eastAsia="Calibri" w:hAnsi="Calibri"/>
+            <w:color w:val="0563C1"/>
+            <w:sz w:val="16"/>
+            <w:szCs w:val="16"/>
+            <w:u w:val="single"/>
+          </w:rPr>
+          <w:t xml:space="preserve">github.com/…/fig_weather_precip.png</w:t>
+        </w:r>
+      </w:hyperlink>
     </w:p>
     <w:p>
       <w:pPr>
@@ -2001,7 +2085,7 @@
     </w:p>
     <w:p>
       <w:pPr>
-        <w:spacing w:after="120"/>
+        <w:spacing w:after="20"/>
         <w:jc w:val="center"/>
       </w:pPr>
       <w:r>
@@ -2015,6 +2099,34 @@
         </w:rPr>
         <w:t xml:space="preserve">100% of events joined within 90 minutes; the two stations agree on rain for 94% of events.</w:t>
       </w:r>
+    </w:p>
+    <w:p>
+      <w:pPr>
+        <w:spacing w:after="120"/>
+        <w:jc w:val="center"/>
+      </w:pPr>
+      <w:r>
+        <w:rPr>
+          <w:rFonts w:ascii="Calibri" w:cs="Calibri" w:eastAsia="Calibri" w:hAnsi="Calibri"/>
+          <w:color w:val="5B6B79"/>
+          <w:sz w:val="16"/>
+          <w:szCs w:val="16"/>
+        </w:rPr>
+        <w:t xml:space="preserve">⬇ on GitHub: </w:t>
+      </w:r>
+      <w:hyperlink w:history="1" r:id="rIdukljrqipsbdb_tc0lsy-r">
+        <w:r>
+          <w:rPr>
+            <w:rStyle w:val="Hyperlink"/>
+            <w:rFonts w:ascii="Calibri" w:cs="Calibri" w:eastAsia="Calibri" w:hAnsi="Calibri"/>
+            <w:color w:val="0563C1"/>
+            <w:sz w:val="16"/>
+            <w:szCs w:val="16"/>
+            <w:u w:val="single"/>
+          </w:rPr>
+          <w:t xml:space="preserve">github.com/…/fig_weather_join.png</w:t>
+        </w:r>
+      </w:hyperlink>
     </w:p>
     <w:p>
       <w:pPr>
@@ -2158,7 +2270,7 @@
     </w:p>
     <w:p>
       <w:pPr>
-        <w:spacing w:after="120"/>
+        <w:spacing w:after="20"/>
         <w:jc w:val="center"/>
       </w:pPr>
       <w:r>
@@ -2172,6 +2284,34 @@
         </w:rPr>
         <w:t xml:space="preserve">Descriptive median segment time, dry 204 s vs rain 212 s.</w:t>
       </w:r>
+    </w:p>
+    <w:p>
+      <w:pPr>
+        <w:spacing w:after="120"/>
+        <w:jc w:val="center"/>
+      </w:pPr>
+      <w:r>
+        <w:rPr>
+          <w:rFonts w:ascii="Calibri" w:cs="Calibri" w:eastAsia="Calibri" w:hAnsi="Calibri"/>
+          <w:color w:val="5B6B79"/>
+          <w:sz w:val="16"/>
+          <w:szCs w:val="16"/>
+        </w:rPr>
+        <w:t xml:space="preserve">⬇ on GitHub: </w:t>
+      </w:r>
+      <w:hyperlink w:history="1" r:id="rIdw_tceak70pyychgu0xzj4">
+        <w:r>
+          <w:rPr>
+            <w:rStyle w:val="Hyperlink"/>
+            <w:rFonts w:ascii="Calibri" w:cs="Calibri" w:eastAsia="Calibri" w:hAnsi="Calibri"/>
+            <w:color w:val="0563C1"/>
+            <w:sz w:val="16"/>
+            <w:szCs w:val="16"/>
+            <w:u w:val="single"/>
+          </w:rPr>
+          <w:t xml:space="preserve">github.com/…/fig_weather_traveltime.png</w:t>
+        </w:r>
+      </w:hyperlink>
     </w:p>
     <w:p>
       <w:pPr>
@@ -2413,7 +2553,7 @@
     </w:p>
     <w:p>
       <w:pPr>
-        <w:spacing w:after="120"/>
+        <w:spacing w:after="20"/>
         <w:jc w:val="center"/>
       </w:pPr>
       <w:r>
@@ -2427,6 +2567,34 @@
         </w:rPr>
         <w:t xml:space="preserve">The funnel: 9,197,694 raw records reduce to 229,421 direction-6 stop-events.</w:t>
       </w:r>
+    </w:p>
+    <w:p>
+      <w:pPr>
+        <w:spacing w:after="120"/>
+        <w:jc w:val="center"/>
+      </w:pPr>
+      <w:r>
+        <w:rPr>
+          <w:rFonts w:ascii="Calibri" w:cs="Calibri" w:eastAsia="Calibri" w:hAnsi="Calibri"/>
+          <w:color w:val="5B6B79"/>
+          <w:sz w:val="16"/>
+          <w:szCs w:val="16"/>
+        </w:rPr>
+        <w:t xml:space="preserve">⬇ on GitHub: </w:t>
+      </w:r>
+      <w:hyperlink w:history="1" r:id="rId6obnkxbnaxuuoelumr-h_">
+        <w:r>
+          <w:rPr>
+            <w:rStyle w:val="Hyperlink"/>
+            <w:rFonts w:ascii="Calibri" w:cs="Calibri" w:eastAsia="Calibri" w:hAnsi="Calibri"/>
+            <w:color w:val="0563C1"/>
+            <w:sz w:val="16"/>
+            <w:szCs w:val="16"/>
+            <w:u w:val="single"/>
+          </w:rPr>
+          <w:t xml:space="preserve">github.com/…/fig_funnel.png</w:t>
+        </w:r>
+      </w:hyperlink>
     </w:p>
     <w:p>
       <w:pPr>
@@ -2529,7 +2697,7 @@
     </w:p>
     <w:p>
       <w:pPr>
-        <w:spacing w:after="120"/>
+        <w:spacing w:after="20"/>
         <w:jc w:val="center"/>
       </w:pPr>
       <w:r>
@@ -2543,6 +2711,34 @@
         </w:rPr>
         <w:t xml:space="preserve">Records removed within Route 801, by rule.</w:t>
       </w:r>
+    </w:p>
+    <w:p>
+      <w:pPr>
+        <w:spacing w:after="120"/>
+        <w:jc w:val="center"/>
+      </w:pPr>
+      <w:r>
+        <w:rPr>
+          <w:rFonts w:ascii="Calibri" w:cs="Calibri" w:eastAsia="Calibri" w:hAnsi="Calibri"/>
+          <w:color w:val="5B6B79"/>
+          <w:sz w:val="16"/>
+          <w:szCs w:val="16"/>
+        </w:rPr>
+        <w:t xml:space="preserve">⬇ on GitHub: </w:t>
+      </w:r>
+      <w:hyperlink w:history="1" r:id="rIdp5acvkcsshuvajgnovatw">
+        <w:r>
+          <w:rPr>
+            <w:rStyle w:val="Hyperlink"/>
+            <w:rFonts w:ascii="Calibri" w:cs="Calibri" w:eastAsia="Calibri" w:hAnsi="Calibri"/>
+            <w:color w:val="0563C1"/>
+            <w:sz w:val="16"/>
+            <w:szCs w:val="16"/>
+            <w:u w:val="single"/>
+          </w:rPr>
+          <w:t xml:space="preserve">github.com/…/fig_exclusions.png</w:t>
+        </w:r>
+      </w:hyperlink>
     </w:p>
     <w:p>
       <w:pPr>
@@ -2749,7 +2945,7 @@
     </w:p>
     <w:p>
       <w:pPr>
-        <w:spacing w:after="120"/>
+        <w:spacing w:after="20"/>
         <w:jc w:val="center"/>
       </w:pPr>
       <w:r>
@@ -2763,6 +2959,34 @@
         </w:rPr>
         <w:t xml:space="preserve">Long right tails motivate the filters and the median (dashed) over the mean.</w:t>
       </w:r>
+    </w:p>
+    <w:p>
+      <w:pPr>
+        <w:spacing w:after="120"/>
+        <w:jc w:val="center"/>
+      </w:pPr>
+      <w:r>
+        <w:rPr>
+          <w:rFonts w:ascii="Calibri" w:cs="Calibri" w:eastAsia="Calibri" w:hAnsi="Calibri"/>
+          <w:color w:val="5B6B79"/>
+          <w:sz w:val="16"/>
+          <w:szCs w:val="16"/>
+        </w:rPr>
+        <w:t xml:space="preserve">⬇ on GitHub: </w:t>
+      </w:r>
+      <w:hyperlink w:history="1" r:id="rIdyjnjznvt_nv1e631qkqng">
+        <w:r>
+          <w:rPr>
+            <w:rStyle w:val="Hyperlink"/>
+            <w:rFonts w:ascii="Calibri" w:cs="Calibri" w:eastAsia="Calibri" w:hAnsi="Calibri"/>
+            <w:color w:val="0563C1"/>
+            <w:sz w:val="16"/>
+            <w:szCs w:val="16"/>
+            <w:u w:val="single"/>
+          </w:rPr>
+          <w:t xml:space="preserve">github.com/…/fig_distributions.png</w:t>
+        </w:r>
+      </w:hyperlink>
     </w:p>
     <w:p>
       <w:pPr>
@@ -2840,7 +3064,7 @@
     </w:p>
     <w:p>
       <w:pPr>
-        <w:spacing w:after="120"/>
+        <w:spacing w:after="20"/>
         <w:jc w:val="center"/>
       </w:pPr>
       <w:r>
@@ -2854,6 +3078,34 @@
         </w:rPr>
         <w:t xml:space="preserve">Mean boardings per bus visit along the 26 stops.</w:t>
       </w:r>
+    </w:p>
+    <w:p>
+      <w:pPr>
+        <w:spacing w:after="120"/>
+        <w:jc w:val="center"/>
+      </w:pPr>
+      <w:r>
+        <w:rPr>
+          <w:rFonts w:ascii="Calibri" w:cs="Calibri" w:eastAsia="Calibri" w:hAnsi="Calibri"/>
+          <w:color w:val="5B6B79"/>
+          <w:sz w:val="16"/>
+          <w:szCs w:val="16"/>
+        </w:rPr>
+        <w:t xml:space="preserve">⬇ on GitHub: </w:t>
+      </w:r>
+      <w:hyperlink w:history="1" r:id="rIdwws83hjx7fwvqce_qqxxg">
+        <w:r>
+          <w:rPr>
+            <w:rStyle w:val="Hyperlink"/>
+            <w:rFonts w:ascii="Calibri" w:cs="Calibri" w:eastAsia="Calibri" w:hAnsi="Calibri"/>
+            <w:color w:val="0563C1"/>
+            <w:sz w:val="16"/>
+            <w:szCs w:val="16"/>
+            <w:u w:val="single"/>
+          </w:rPr>
+          <w:t xml:space="preserve">github.com/…/fig_demand_profile.png</w:t>
+        </w:r>
+      </w:hyperlink>
     </w:p>
     <w:p>
       <w:pPr>
@@ -2974,7 +3226,7 @@
     </w:p>
     <w:p>
       <w:pPr>
-        <w:spacing w:after="120"/>
+        <w:spacing w:after="20"/>
         <w:jc w:val="center"/>
       </w:pPr>
       <w:r>
@@ -2988,6 +3240,34 @@
         </w:rPr>
         <w:t xml:space="preserve">Cleaned direction-6 events per month, Jul–Dec 2021 (184 service days).</w:t>
       </w:r>
+    </w:p>
+    <w:p>
+      <w:pPr>
+        <w:spacing w:after="120"/>
+        <w:jc w:val="center"/>
+      </w:pPr>
+      <w:r>
+        <w:rPr>
+          <w:rFonts w:ascii="Calibri" w:cs="Calibri" w:eastAsia="Calibri" w:hAnsi="Calibri"/>
+          <w:color w:val="5B6B79"/>
+          <w:sz w:val="16"/>
+          <w:szCs w:val="16"/>
+        </w:rPr>
+        <w:t xml:space="preserve">⬇ on GitHub: </w:t>
+      </w:r>
+      <w:hyperlink w:history="1" r:id="rIdpfoy5xa03h2clqj3xa6cg">
+        <w:r>
+          <w:rPr>
+            <w:rStyle w:val="Hyperlink"/>
+            <w:rFonts w:ascii="Calibri" w:cs="Calibri" w:eastAsia="Calibri" w:hAnsi="Calibri"/>
+            <w:color w:val="0563C1"/>
+            <w:sz w:val="16"/>
+            <w:szCs w:val="16"/>
+            <w:u w:val="single"/>
+          </w:rPr>
+          <w:t xml:space="preserve">github.com/…/fig_temporal.png</w:t>
+        </w:r>
+      </w:hyperlink>
     </w:p>
     <w:p>
       <w:pPr>
@@ -3180,7 +3460,7 @@
     </w:p>
     <w:p>
       <w:pPr>
-        <w:spacing w:after="120"/>
+        <w:spacing w:after="20"/>
         <w:jc w:val="center"/>
       </w:pPr>
       <w:r>
@@ -3194,6 +3474,34 @@
         </w:rPr>
         <w:t xml:space="preserve">Simulated vs observed segment running times; all 25 segments on the identity line.</w:t>
       </w:r>
+    </w:p>
+    <w:p>
+      <w:pPr>
+        <w:spacing w:after="120"/>
+        <w:jc w:val="center"/>
+      </w:pPr>
+      <w:r>
+        <w:rPr>
+          <w:rFonts w:ascii="Calibri" w:cs="Calibri" w:eastAsia="Calibri" w:hAnsi="Calibri"/>
+          <w:color w:val="5B6B79"/>
+          <w:sz w:val="16"/>
+          <w:szCs w:val="16"/>
+        </w:rPr>
+        <w:t xml:space="preserve">⬇ on GitHub: </w:t>
+      </w:r>
+      <w:hyperlink w:history="1" r:id="rIdyf3hb0cly1mg2oxuqstp1">
+        <w:r>
+          <w:rPr>
+            <w:rStyle w:val="Hyperlink"/>
+            <w:rFonts w:ascii="Calibri" w:cs="Calibri" w:eastAsia="Calibri" w:hAnsi="Calibri"/>
+            <w:color w:val="0563C1"/>
+            <w:sz w:val="16"/>
+            <w:szCs w:val="16"/>
+            <w:u w:val="single"/>
+          </w:rPr>
+          <w:t xml:space="preserve">github.com/…/calibration_validation.png</w:t>
+        </w:r>
+      </w:hyperlink>
     </w:p>
     <w:p>
       <w:pPr>
@@ -3421,6 +3729,517 @@
         </w:rPr>
         <w:t xml:space="preserve">That's our environment and its validation. We're happy to take questions.</w:t>
       </w:r>
+    </w:p>
+    <w:p>
+      <w:r>
+        <w:br w:type="page"/>
+      </w:r>
+    </w:p>
+    <w:p>
+      <w:pPr>
+        <w:pStyle w:val="Heading2"/>
+        <w:spacing w:after="50" w:before="140"/>
+      </w:pPr>
+      <w:r>
+        <w:rPr>
+          <w:rFonts w:ascii="Calibri Light" w:cs="Calibri Light" w:eastAsia="Calibri Light" w:hAnsi="Calibri Light"/>
+          <w:b/>
+          <w:bCs/>
+          <w:color w:val="1C7293"/>
+          <w:sz w:val="22"/>
+          <w:szCs w:val="22"/>
+        </w:rPr>
+        <w:t xml:space="preserve">All figures on GitHub</w:t>
+      </w:r>
+    </w:p>
+    <w:p>
+      <w:pPr>
+        <w:spacing w:after="120" w:line="272"/>
+        <w:jc w:val="both"/>
+      </w:pPr>
+      <w:r>
+        <w:rPr>
+          <w:rFonts w:ascii="Calibri" w:cs="Calibri" w:eastAsia="Calibri" w:hAnsi="Calibri"/>
+          <w:sz w:val="22"/>
+          <w:szCs w:val="22"/>
+        </w:rPr>
+        <w:t xml:space="preserve">Every figure in this document lives in the team repository (branch dataset/texas-capmetro-801). Click a folder to browse, or use the per-figure links under each figure above. Each figure is also available as a vector PDF next to its PNG.</w:t>
+      </w:r>
+    </w:p>
+    <w:p>
+      <w:pPr>
+        <w:spacing w:after="60"/>
+      </w:pPr>
+      <w:r>
+        <w:rPr>
+          <w:rFonts w:ascii="Calibri" w:cs="Calibri" w:eastAsia="Calibri" w:hAnsi="Calibri"/>
+          <w:color w:val="18242F"/>
+          <w:sz w:val="20"/>
+          <w:szCs w:val="20"/>
+        </w:rPr>
+        <w:t xml:space="preserve">• Data-cleaning figures (folder):  </w:t>
+      </w:r>
+      <w:hyperlink w:history="1" r:id="rIdz_uza-a7xxl0esybo-la8">
+        <w:r>
+          <w:rPr>
+            <w:rStyle w:val="Hyperlink"/>
+            <w:rFonts w:ascii="Calibri" w:cs="Calibri" w:eastAsia="Calibri" w:hAnsi="Calibri"/>
+            <w:color w:val="0563C1"/>
+            <w:sz w:val="16"/>
+            <w:szCs w:val="16"/>
+            <w:u w:val="single"/>
+          </w:rPr>
+          <w:t xml:space="preserve">github.com/…/starter/results/figures/datacleaning</w:t>
+        </w:r>
+      </w:hyperlink>
+    </w:p>
+    <w:p>
+      <w:pPr>
+        <w:spacing w:after="60"/>
+      </w:pPr>
+      <w:r>
+        <w:rPr>
+          <w:rFonts w:ascii="Calibri" w:cs="Calibri" w:eastAsia="Calibri" w:hAnsi="Calibri"/>
+          <w:color w:val="18242F"/>
+          <w:sz w:val="20"/>
+          <w:szCs w:val="20"/>
+        </w:rPr>
+        <w:t xml:space="preserve">• Weather-dataset figures (folder):  </w:t>
+      </w:r>
+      <w:hyperlink w:history="1" r:id="rIdt9-zfs2sjgbtu08p4rb-c">
+        <w:r>
+          <w:rPr>
+            <w:rStyle w:val="Hyperlink"/>
+            <w:rFonts w:ascii="Calibri" w:cs="Calibri" w:eastAsia="Calibri" w:hAnsi="Calibri"/>
+            <w:color w:val="0563C1"/>
+            <w:sz w:val="16"/>
+            <w:szCs w:val="16"/>
+            <w:u w:val="single"/>
+          </w:rPr>
+          <w:t xml:space="preserve">github.com/…/starter/results/figures/weather</w:t>
+        </w:r>
+      </w:hyperlink>
+    </w:p>
+    <w:p>
+      <w:pPr>
+        <w:spacing w:after="60"/>
+      </w:pPr>
+      <w:r>
+        <w:rPr>
+          <w:rFonts w:ascii="Calibri" w:cs="Calibri" w:eastAsia="Calibri" w:hAnsi="Calibri"/>
+          <w:color w:val="18242F"/>
+          <w:sz w:val="20"/>
+          <w:szCs w:val="20"/>
+        </w:rPr>
+        <w:t xml:space="preserve">• Results &amp; calibration figures (folder):  </w:t>
+      </w:r>
+      <w:hyperlink w:history="1" r:id="rIdjzfij_bb_awfmuz2jgmmd">
+        <w:r>
+          <w:rPr>
+            <w:rStyle w:val="Hyperlink"/>
+            <w:rFonts w:ascii="Calibri" w:cs="Calibri" w:eastAsia="Calibri" w:hAnsi="Calibri"/>
+            <w:color w:val="0563C1"/>
+            <w:sz w:val="16"/>
+            <w:szCs w:val="16"/>
+            <w:u w:val="single"/>
+          </w:rPr>
+          <w:t xml:space="preserve">github.com/…/starter/results/figures</w:t>
+        </w:r>
+      </w:hyperlink>
+    </w:p>
+    <w:p>
+      <w:pPr>
+        <w:spacing w:after="60"/>
+      </w:pPr>
+      <w:r>
+        <w:rPr>
+          <w:rFonts w:ascii="Calibri" w:cs="Calibri" w:eastAsia="Calibri" w:hAnsi="Calibri"/>
+          <w:color w:val="18242F"/>
+          <w:sz w:val="20"/>
+          <w:szCs w:val="20"/>
+        </w:rPr>
+        <w:t xml:space="preserve">• Figure captions (data-cleaning):  </w:t>
+      </w:r>
+      <w:hyperlink w:history="1" r:id="rId0f6apmedinvvyyhvxvqok">
+        <w:r>
+          <w:rPr>
+            <w:rStyle w:val="Hyperlink"/>
+            <w:rFonts w:ascii="Calibri" w:cs="Calibri" w:eastAsia="Calibri" w:hAnsi="Calibri"/>
+            <w:color w:val="0563C1"/>
+            <w:sz w:val="16"/>
+            <w:szCs w:val="16"/>
+            <w:u w:val="single"/>
+          </w:rPr>
+          <w:t xml:space="preserve">github.com/…/starter/results/figures/datacleaning/CAPTIONS.md</w:t>
+        </w:r>
+      </w:hyperlink>
+    </w:p>
+    <w:p>
+      <w:pPr>
+        <w:spacing w:after="60"/>
+      </w:pPr>
+      <w:r>
+        <w:rPr>
+          <w:rFonts w:ascii="Calibri" w:cs="Calibri" w:eastAsia="Calibri" w:hAnsi="Calibri"/>
+          <w:color w:val="18242F"/>
+          <w:sz w:val="20"/>
+          <w:szCs w:val="20"/>
+        </w:rPr>
+        <w:t xml:space="preserve">• Figure captions (weather):  </w:t>
+      </w:r>
+      <w:hyperlink w:history="1" r:id="rIdgp4zgezkqje5bohncm2bl">
+        <w:r>
+          <w:rPr>
+            <w:rStyle w:val="Hyperlink"/>
+            <w:rFonts w:ascii="Calibri" w:cs="Calibri" w:eastAsia="Calibri" w:hAnsi="Calibri"/>
+            <w:color w:val="0563C1"/>
+            <w:sz w:val="16"/>
+            <w:szCs w:val="16"/>
+            <w:u w:val="single"/>
+          </w:rPr>
+          <w:t xml:space="preserve">github.com/…/starter/results/figures/weather/CAPTIONS.md</w:t>
+        </w:r>
+      </w:hyperlink>
+    </w:p>
+    <w:p>
+      <w:pPr>
+        <w:spacing w:after="40" w:before="120"/>
+      </w:pPr>
+      <w:r>
+        <w:rPr>
+          <w:rFonts w:ascii="Calibri" w:cs="Calibri" w:eastAsia="Calibri" w:hAnsi="Calibri"/>
+          <w:b/>
+          <w:bCs/>
+          <w:color w:val="0B3D62"/>
+          <w:sz w:val="20"/>
+          <w:szCs w:val="20"/>
+        </w:rPr>
+        <w:t xml:space="preserve">Individual figures:</w:t>
+      </w:r>
+    </w:p>
+    <w:p>
+      <w:pPr>
+        <w:spacing w:after="40"/>
+      </w:pPr>
+      <w:r>
+        <w:rPr>
+          <w:rFonts w:ascii="Calibri" w:cs="Calibri" w:eastAsia="Calibri" w:hAnsi="Calibri"/>
+          <w:color w:val="18242F"/>
+          <w:sz w:val="19"/>
+          <w:szCs w:val="19"/>
+        </w:rPr>
+        <w:t xml:space="preserve">• fig_funnel.png:  </w:t>
+      </w:r>
+      <w:hyperlink w:history="1" r:id="rIddget6d_-ajk925hxfazrk">
+        <w:r>
+          <w:rPr>
+            <w:rStyle w:val="Hyperlink"/>
+            <w:rFonts w:ascii="Calibri" w:cs="Calibri" w:eastAsia="Calibri" w:hAnsi="Calibri"/>
+            <w:color w:val="0563C1"/>
+            <w:sz w:val="16"/>
+            <w:szCs w:val="16"/>
+            <w:u w:val="single"/>
+          </w:rPr>
+          <w:t xml:space="preserve">open on GitHub</w:t>
+        </w:r>
+      </w:hyperlink>
+    </w:p>
+    <w:p>
+      <w:pPr>
+        <w:spacing w:after="40"/>
+      </w:pPr>
+      <w:r>
+        <w:rPr>
+          <w:rFonts w:ascii="Calibri" w:cs="Calibri" w:eastAsia="Calibri" w:hAnsi="Calibri"/>
+          <w:color w:val="18242F"/>
+          <w:sz w:val="19"/>
+          <w:szCs w:val="19"/>
+        </w:rPr>
+        <w:t xml:space="preserve">• fig_exclusions.png:  </w:t>
+      </w:r>
+      <w:hyperlink w:history="1" r:id="rIdhp4p33t4nwm3bybfd4frg">
+        <w:r>
+          <w:rPr>
+            <w:rStyle w:val="Hyperlink"/>
+            <w:rFonts w:ascii="Calibri" w:cs="Calibri" w:eastAsia="Calibri" w:hAnsi="Calibri"/>
+            <w:color w:val="0563C1"/>
+            <w:sz w:val="16"/>
+            <w:szCs w:val="16"/>
+            <w:u w:val="single"/>
+          </w:rPr>
+          <w:t xml:space="preserve">open on GitHub</w:t>
+        </w:r>
+      </w:hyperlink>
+    </w:p>
+    <w:p>
+      <w:pPr>
+        <w:spacing w:after="40"/>
+      </w:pPr>
+      <w:r>
+        <w:rPr>
+          <w:rFonts w:ascii="Calibri" w:cs="Calibri" w:eastAsia="Calibri" w:hAnsi="Calibri"/>
+          <w:color w:val="18242F"/>
+          <w:sz w:val="19"/>
+          <w:szCs w:val="19"/>
+        </w:rPr>
+        <w:t xml:space="preserve">• fig_route_selection.png:  </w:t>
+      </w:r>
+      <w:hyperlink w:history="1" r:id="rId8nkroo4pezchtg16a_xvf">
+        <w:r>
+          <w:rPr>
+            <w:rStyle w:val="Hyperlink"/>
+            <w:rFonts w:ascii="Calibri" w:cs="Calibri" w:eastAsia="Calibri" w:hAnsi="Calibri"/>
+            <w:color w:val="0563C1"/>
+            <w:sz w:val="16"/>
+            <w:szCs w:val="16"/>
+            <w:u w:val="single"/>
+          </w:rPr>
+          <w:t xml:space="preserve">open on GitHub</w:t>
+        </w:r>
+      </w:hyperlink>
+    </w:p>
+    <w:p>
+      <w:pPr>
+        <w:spacing w:after="40"/>
+      </w:pPr>
+      <w:r>
+        <w:rPr>
+          <w:rFonts w:ascii="Calibri" w:cs="Calibri" w:eastAsia="Calibri" w:hAnsi="Calibri"/>
+          <w:color w:val="18242F"/>
+          <w:sz w:val="19"/>
+          <w:szCs w:val="19"/>
+        </w:rPr>
+        <w:t xml:space="preserve">• fig_distributions.png:  </w:t>
+      </w:r>
+      <w:hyperlink w:history="1" r:id="rIdsbefmyfxp2qx0g-mquotv">
+        <w:r>
+          <w:rPr>
+            <w:rStyle w:val="Hyperlink"/>
+            <w:rFonts w:ascii="Calibri" w:cs="Calibri" w:eastAsia="Calibri" w:hAnsi="Calibri"/>
+            <w:color w:val="0563C1"/>
+            <w:sz w:val="16"/>
+            <w:szCs w:val="16"/>
+            <w:u w:val="single"/>
+          </w:rPr>
+          <w:t xml:space="preserve">open on GitHub</w:t>
+        </w:r>
+      </w:hyperlink>
+    </w:p>
+    <w:p>
+      <w:pPr>
+        <w:spacing w:after="40"/>
+      </w:pPr>
+      <w:r>
+        <w:rPr>
+          <w:rFonts w:ascii="Calibri" w:cs="Calibri" w:eastAsia="Calibri" w:hAnsi="Calibri"/>
+          <w:color w:val="18242F"/>
+          <w:sz w:val="19"/>
+          <w:szCs w:val="19"/>
+        </w:rPr>
+        <w:t xml:space="preserve">• fig_demand_profile.png:  </w:t>
+      </w:r>
+      <w:hyperlink w:history="1" r:id="rIdvd4akb-ubqhiwcfkzm7he">
+        <w:r>
+          <w:rPr>
+            <w:rStyle w:val="Hyperlink"/>
+            <w:rFonts w:ascii="Calibri" w:cs="Calibri" w:eastAsia="Calibri" w:hAnsi="Calibri"/>
+            <w:color w:val="0563C1"/>
+            <w:sz w:val="16"/>
+            <w:szCs w:val="16"/>
+            <w:u w:val="single"/>
+          </w:rPr>
+          <w:t xml:space="preserve">open on GitHub</w:t>
+        </w:r>
+      </w:hyperlink>
+    </w:p>
+    <w:p>
+      <w:pPr>
+        <w:spacing w:after="40"/>
+      </w:pPr>
+      <w:r>
+        <w:rPr>
+          <w:rFonts w:ascii="Calibri" w:cs="Calibri" w:eastAsia="Calibri" w:hAnsi="Calibri"/>
+          <w:color w:val="18242F"/>
+          <w:sz w:val="19"/>
+          <w:szCs w:val="19"/>
+        </w:rPr>
+        <w:t xml:space="preserve">• fig_corridor_map.png:  </w:t>
+      </w:r>
+      <w:hyperlink w:history="1" r:id="rIdo5le2jo8gmjjrirddlhsd">
+        <w:r>
+          <w:rPr>
+            <w:rStyle w:val="Hyperlink"/>
+            <w:rFonts w:ascii="Calibri" w:cs="Calibri" w:eastAsia="Calibri" w:hAnsi="Calibri"/>
+            <w:color w:val="0563C1"/>
+            <w:sz w:val="16"/>
+            <w:szCs w:val="16"/>
+            <w:u w:val="single"/>
+          </w:rPr>
+          <w:t xml:space="preserve">open on GitHub</w:t>
+        </w:r>
+      </w:hyperlink>
+    </w:p>
+    <w:p>
+      <w:pPr>
+        <w:spacing w:after="40"/>
+      </w:pPr>
+      <w:r>
+        <w:rPr>
+          <w:rFonts w:ascii="Calibri" w:cs="Calibri" w:eastAsia="Calibri" w:hAnsi="Calibri"/>
+          <w:color w:val="18242F"/>
+          <w:sz w:val="19"/>
+          <w:szCs w:val="19"/>
+        </w:rPr>
+        <w:t xml:space="preserve">• fig_temporal.png:  </w:t>
+      </w:r>
+      <w:hyperlink w:history="1" r:id="rId73bwhkc8tmgln4ucuakhq">
+        <w:r>
+          <w:rPr>
+            <w:rStyle w:val="Hyperlink"/>
+            <w:rFonts w:ascii="Calibri" w:cs="Calibri" w:eastAsia="Calibri" w:hAnsi="Calibri"/>
+            <w:color w:val="0563C1"/>
+            <w:sz w:val="16"/>
+            <w:szCs w:val="16"/>
+            <w:u w:val="single"/>
+          </w:rPr>
+          <w:t xml:space="preserve">open on GitHub</w:t>
+        </w:r>
+      </w:hyperlink>
+    </w:p>
+    <w:p>
+      <w:pPr>
+        <w:spacing w:after="40"/>
+      </w:pPr>
+      <w:r>
+        <w:rPr>
+          <w:rFonts w:ascii="Calibri" w:cs="Calibri" w:eastAsia="Calibri" w:hAnsi="Calibri"/>
+          <w:color w:val="18242F"/>
+          <w:sz w:val="19"/>
+          <w:szCs w:val="19"/>
+        </w:rPr>
+        <w:t xml:space="preserve">• calibration_validation.png:  </w:t>
+      </w:r>
+      <w:hyperlink w:history="1" r:id="rIdssectkh5iwc0aatwcvesm">
+        <w:r>
+          <w:rPr>
+            <w:rStyle w:val="Hyperlink"/>
+            <w:rFonts w:ascii="Calibri" w:cs="Calibri" w:eastAsia="Calibri" w:hAnsi="Calibri"/>
+            <w:color w:val="0563C1"/>
+            <w:sz w:val="16"/>
+            <w:szCs w:val="16"/>
+            <w:u w:val="single"/>
+          </w:rPr>
+          <w:t xml:space="preserve">open on GitHub</w:t>
+        </w:r>
+      </w:hyperlink>
+    </w:p>
+    <w:p>
+      <w:pPr>
+        <w:spacing w:after="40"/>
+      </w:pPr>
+      <w:r>
+        <w:rPr>
+          <w:rFonts w:ascii="Calibri" w:cs="Calibri" w:eastAsia="Calibri" w:hAnsi="Calibri"/>
+          <w:color w:val="18242F"/>
+          <w:sz w:val="19"/>
+          <w:szCs w:val="19"/>
+        </w:rPr>
+        <w:t xml:space="preserve">• fig_weather_precip.png:  </w:t>
+      </w:r>
+      <w:hyperlink w:history="1" r:id="rIdlaae3hvhpnwp-kbmil819">
+        <w:r>
+          <w:rPr>
+            <w:rStyle w:val="Hyperlink"/>
+            <w:rFonts w:ascii="Calibri" w:cs="Calibri" w:eastAsia="Calibri" w:hAnsi="Calibri"/>
+            <w:color w:val="0563C1"/>
+            <w:sz w:val="16"/>
+            <w:szCs w:val="16"/>
+            <w:u w:val="single"/>
+          </w:rPr>
+          <w:t xml:space="preserve">open on GitHub</w:t>
+        </w:r>
+      </w:hyperlink>
+    </w:p>
+    <w:p>
+      <w:pPr>
+        <w:spacing w:after="40"/>
+      </w:pPr>
+      <w:r>
+        <w:rPr>
+          <w:rFonts w:ascii="Calibri" w:cs="Calibri" w:eastAsia="Calibri" w:hAnsi="Calibri"/>
+          <w:color w:val="18242F"/>
+          <w:sz w:val="19"/>
+          <w:szCs w:val="19"/>
+        </w:rPr>
+        <w:t xml:space="preserve">• fig_weather_exposure.png:  </w:t>
+      </w:r>
+      <w:hyperlink w:history="1" r:id="rIdvabxrzojyabvs6suikb06">
+        <w:r>
+          <w:rPr>
+            <w:rStyle w:val="Hyperlink"/>
+            <w:rFonts w:ascii="Calibri" w:cs="Calibri" w:eastAsia="Calibri" w:hAnsi="Calibri"/>
+            <w:color w:val="0563C1"/>
+            <w:sz w:val="16"/>
+            <w:szCs w:val="16"/>
+            <w:u w:val="single"/>
+          </w:rPr>
+          <w:t xml:space="preserve">open on GitHub</w:t>
+        </w:r>
+      </w:hyperlink>
+    </w:p>
+    <w:p>
+      <w:pPr>
+        <w:spacing w:after="40"/>
+      </w:pPr>
+      <w:r>
+        <w:rPr>
+          <w:rFonts w:ascii="Calibri" w:cs="Calibri" w:eastAsia="Calibri" w:hAnsi="Calibri"/>
+          <w:color w:val="18242F"/>
+          <w:sz w:val="19"/>
+          <w:szCs w:val="19"/>
+        </w:rPr>
+        <w:t xml:space="preserve">• fig_weather_traveltime.png:  </w:t>
+      </w:r>
+      <w:hyperlink w:history="1" r:id="rIduzgofdpqrr5q5m4v216gy">
+        <w:r>
+          <w:rPr>
+            <w:rStyle w:val="Hyperlink"/>
+            <w:rFonts w:ascii="Calibri" w:cs="Calibri" w:eastAsia="Calibri" w:hAnsi="Calibri"/>
+            <w:color w:val="0563C1"/>
+            <w:sz w:val="16"/>
+            <w:szCs w:val="16"/>
+            <w:u w:val="single"/>
+          </w:rPr>
+          <w:t xml:space="preserve">open on GitHub</w:t>
+        </w:r>
+      </w:hyperlink>
+    </w:p>
+    <w:p>
+      <w:pPr>
+        <w:spacing w:after="40"/>
+      </w:pPr>
+      <w:r>
+        <w:rPr>
+          <w:rFonts w:ascii="Calibri" w:cs="Calibri" w:eastAsia="Calibri" w:hAnsi="Calibri"/>
+          <w:color w:val="18242F"/>
+          <w:sz w:val="19"/>
+          <w:szCs w:val="19"/>
+        </w:rPr>
+        <w:t xml:space="preserve">• fig_weather_join.png:  </w:t>
+      </w:r>
+      <w:hyperlink w:history="1" r:id="rId2pe3xjnxa5kefgsipkumc">
+        <w:r>
+          <w:rPr>
+            <w:rStyle w:val="Hyperlink"/>
+            <w:rFonts w:ascii="Calibri" w:cs="Calibri" w:eastAsia="Calibri" w:hAnsi="Calibri"/>
+            <w:color w:val="0563C1"/>
+            <w:sz w:val="16"/>
+            <w:szCs w:val="16"/>
+            <w:u w:val="single"/>
+          </w:rPr>
+          <w:t xml:space="preserve">open on GitHub</w:t>
+        </w:r>
+      </w:hyperlink>
     </w:p>
     <w:sectPr>
       <w:pgSz w:w="12240" w:h="15840" w:orient="portrait"/>

</xml_diff>